<commit_message>
Ajustes en el sistema de evaluación adaptativo como lo solicito la empresa
</commit_message>
<xml_diff>
--- a/docs/Manual_de_Usuario.docx
+++ b/docs/Manual_de_Usuario.docx
@@ -16,7 +16,7 @@
         <w:spacing w:after="120"/>
       </w:pPr>
       <w:r>
-        <w:t>Fecha: 21/10/2025</w:t>
+        <w:t>Fecha: 28/10/2025</w:t>
       </w:r>
     </w:p>
     <w:p>
@@ -38,6 +38,38 @@
         <w:jc w:val="center"/>
       </w:pPr>
       <w:r>
+        <w:t>Tabla de contenido</w:t>
+      </w:r>
+    </w:p>
+    <w:p>
+      <w:r>
+        <w:fldChar w:fldCharType="begin"/>
+        <w:instrText xml:space="preserve">TOC \o "1-3" \h \z \u</w:instrText>
+        <w:fldChar w:fldCharType="separate"/>
+      </w:r>
+      <w:r>
+        <w:fldChar w:fldCharType="end"/>
+      </w:r>
+    </w:p>
+    <w:p>
+      <w:pPr>
+        <w:spacing w:after="120"/>
+      </w:pPr>
+      <w:r>
+        <w:t xml:space="preserve"> </w:t>
+      </w:r>
+    </w:p>
+    <w:p>
+      <w:r>
+        <w:br w:type="page"/>
+      </w:r>
+    </w:p>
+    <w:p>
+      <w:pPr>
+        <w:pStyle w:val="Heading1"/>
+        <w:jc w:val="center"/>
+      </w:pPr>
+      <w:r>
         <w:t>Manual de Usuario — Sistema de Evaluación Técnica</w:t>
       </w:r>
     </w:p>
@@ -56,6 +88,167 @@
       </w:pPr>
       <w:r>
         <w:t>Versión del sistema: 1.0</w:t>
+      </w:r>
+    </w:p>
+    <w:p/>
+    <w:p>
+      <w:pPr>
+        <w:pStyle w:val="Heading2"/>
+      </w:pPr>
+      <w:r>
+        <w:t>Tabla de contenido</w:t>
+      </w:r>
+    </w:p>
+    <w:p>
+      <w:pPr>
+        <w:pStyle w:val="ListBullet"/>
+      </w:pPr>
+      <w:r>
+        <w:t>[1. Descripción general](#1-descripción-general)</w:t>
+      </w:r>
+    </w:p>
+    <w:p>
+      <w:pPr>
+        <w:pStyle w:val="ListBullet"/>
+      </w:pPr>
+      <w:r>
+        <w:t>[2. Requisitos del sistema](#2-requisitos-del-sistema)</w:t>
+      </w:r>
+    </w:p>
+    <w:p>
+      <w:pPr>
+        <w:pStyle w:val="ListBullet"/>
+      </w:pPr>
+      <w:r>
+        <w:t>[3. Acceso y roles](#3-acceso-y-roles)</w:t>
+      </w:r>
+    </w:p>
+    <w:p>
+      <w:pPr>
+        <w:pStyle w:val="ListBullet"/>
+      </w:pPr>
+      <w:r>
+        <w:t>[4. Panel de Administración](#4-panel-de-administración)</w:t>
+      </w:r>
+    </w:p>
+    <w:p>
+      <w:pPr>
+        <w:pStyle w:val="ListBullet"/>
+      </w:pPr>
+      <w:r>
+        <w:t>[4.1. Inicio de sesión](#41-inicio-de-sesión)</w:t>
+      </w:r>
+    </w:p>
+    <w:p>
+      <w:pPr>
+        <w:pStyle w:val="ListBullet"/>
+      </w:pPr>
+      <w:r>
+        <w:t>[4.2. Gestión de candidatos](#42-gestión-de-candidatos)</w:t>
+      </w:r>
+    </w:p>
+    <w:p>
+      <w:pPr>
+        <w:pStyle w:val="ListBullet"/>
+      </w:pPr>
+      <w:r>
+        <w:t>[4.3. Resultados de evaluaciones](#43-resultados-de-evaluaciones)</w:t>
+      </w:r>
+    </w:p>
+    <w:p>
+      <w:pPr>
+        <w:pStyle w:val="ListBullet"/>
+      </w:pPr>
+      <w:r>
+        <w:t>[4.4. Gestión de temas (banco de preguntas)](#44-gestión-de-temas-banco-de-preguntas)</w:t>
+      </w:r>
+    </w:p>
+    <w:p>
+      <w:pPr>
+        <w:pStyle w:val="ListBullet"/>
+      </w:pPr>
+      <w:r>
+        <w:t>[5. Evaluación del candidato](#5-evaluación-del-candidato)</w:t>
+      </w:r>
+    </w:p>
+    <w:p>
+      <w:pPr>
+        <w:pStyle w:val="ListBullet"/>
+      </w:pPr>
+      <w:r>
+        <w:t>[5.1. Flujo](#51-flujo)</w:t>
+      </w:r>
+    </w:p>
+    <w:p>
+      <w:pPr>
+        <w:pStyle w:val="ListBullet"/>
+      </w:pPr>
+      <w:r>
+        <w:t>[5.2. Reglas de avance y finalización](#52-reglas-de-avance-y-finalización)</w:t>
+      </w:r>
+    </w:p>
+    <w:p>
+      <w:pPr>
+        <w:pStyle w:val="ListBullet"/>
+      </w:pPr>
+      <w:r>
+        <w:t>[5.3. Interfaz de evaluación](#53-interfaz-de-evaluación)</w:t>
+      </w:r>
+    </w:p>
+    <w:p>
+      <w:pPr>
+        <w:pStyle w:val="ListBullet"/>
+      </w:pPr>
+      <w:r>
+        <w:t>[6. Reportes PDF](#6-reportes-pdf)</w:t>
+      </w:r>
+    </w:p>
+    <w:p>
+      <w:pPr>
+        <w:pStyle w:val="ListBullet"/>
+      </w:pPr>
+      <w:r>
+        <w:t>[7. Recuperación de contraseña (Administrador)](#7-recuperación-de-contraseña-administrador)</w:t>
+      </w:r>
+    </w:p>
+    <w:p>
+      <w:pPr>
+        <w:pStyle w:val="ListBullet"/>
+      </w:pPr>
+      <w:r>
+        <w:t>[8. Solución de problemas](#8-solución-de-problemas)</w:t>
+      </w:r>
+    </w:p>
+    <w:p>
+      <w:pPr>
+        <w:pStyle w:val="ListBullet"/>
+      </w:pPr>
+      <w:r>
+        <w:t>[9. Seguridad](#9-seguridad)</w:t>
+      </w:r>
+    </w:p>
+    <w:p>
+      <w:pPr>
+        <w:pStyle w:val="ListBullet"/>
+      </w:pPr>
+      <w:r>
+        <w:t>[10. Glosario](#10-glosario)</w:t>
+      </w:r>
+    </w:p>
+    <w:p>
+      <w:pPr>
+        <w:pStyle w:val="ListBullet"/>
+      </w:pPr>
+      <w:r>
+        <w:t>[11. Historial de versiones (extracto)](#11-historial-de-versiones-extracto)</w:t>
+      </w:r>
+    </w:p>
+    <w:p>
+      <w:pPr>
+        <w:pStyle w:val="ListBullet"/>
+      </w:pPr>
+      <w:r>
+        <w:t>[12. Contacto y soporte](#12-contacto-y-soporte)</w:t>
       </w:r>
     </w:p>
     <w:p/>

</xml_diff>